<commit_message>
Update SatAlign to stable v3.1.4
Co-authored-by: Copilot App <223556219+Copilot@users.noreply.github.com>
</commit_message>
<xml_diff>
--- a/docs/SatAlign_ESP32_V3_Einfuehrung.docx
+++ b/docs/SatAlign_ESP32_V3_Einfuehrung.docx
@@ -13,6 +13,23 @@
           <w:sz w:val="40"/>
         </w:rPr>
         <w:t>SatAlign ESP32 V3 - Einführung</w:t>
+      </w:r>
+    </w:p>
+    <w:p>
+      <w:pPr/>
+      <w:r>
+        <w:t>V3.1.4 baut auf der einheitlichen RF-Prozentbewertung von Anzeige und AUTO-Suche auf. Ein normaler RF-Kandidat wird weiterhin erst ab 80 % akzeptiert; der gemeinsame RF-Wert bleibt auf maximal 95 % begrenzt. Ein separater reproduzierbarer RF-/Azimut-Test verglich die Filterwerte 0,75, 0,50 und 0,25. RF_FILTER_ALPHA wurde deshalb auf 0,50 gesetzt: deutlich schnellere Reaktion als 0,75 bei weiterhin ruhigerer Anzeige als mit 0,25.</w:t>
+      </w:r>
+    </w:p>
+    <w:p>
+      <w:pPr/>
+      <w:r>
+        <w:t>Softwarestand: V3.1.4</w:t>
+      </w:r>
+    </w:p>
+    <w:p>
+      <w:r>
+        <w:t>V3.1.1 ergaenzt ElegantOTA fuer Firmware-Updates direkt im Browser. ArduinoOTA fuer Updates aus der Arduino IDE bleibt parallel erhalten.</w:t>
       </w:r>
     </w:p>
     <w:p>
@@ -38,6 +55,15 @@
           <w:sz w:val="22"/>
         </w:rPr>
         <w:t>Projektidee, Konzept und praktische Umsetzungsideen</w:t>
+      </w:r>
+    </w:p>
+    <w:p>
+      <w:pPr/>
+      <w:r>
+        <w:rPr>
+          <w:b/>
+        </w:rPr>
+        <w:t>Dokumentationsstand: SatAlign ESP32 V3.1.4 (stabiler Release)</w:t>
       </w:r>
     </w:p>
     <w:tbl>
@@ -238,9 +264,7 @@
       </w:r>
     </w:p>
     <w:p>
-      <w:r>
-        <w:br w:type="page"/>
-      </w:r>
+      <w:r/>
     </w:p>
     <w:p>
       <w:pPr>
@@ -277,6 +301,18 @@
       </w:r>
     </w:p>
     <w:p>
+      <w:pPr/>
+      <w:r>
+        <w:t>Der aktuelle stabile Softwarestand V3.1.4 nutzt eine einheitliche RF-Prozentbewertung, einen auf 0,50 abgestimmten RF-Filter, eine 80-%-Mindestgrenze fuer AUTO-Kandidaten, eine feste IP im GeniusBulli-Netz sowie ArduinoOTA und ElegantOTA. Die automatische Suche bleibt bewusst bei der praktisch bewaehrten Kandidatenlogik; experimentelle Peak-Rueckfahrten gehoeren nicht zum stabilen Release.</w:t>
+      </w:r>
+    </w:p>
+    <w:p>
+      <w:pPr/>
+      <w:r>
+        <w:t>Fuer Erstinbetriebnahme und Hardwareverdacht bleibt im Repository ausserdem ein separater InstallTest erhalten: tools/SatAlign_ESP32_V3_InstallTest/SatAlign_ESP32_V3_InstallTest.ino. Er prueft Hardwarepfade unabhaengig von der normalen AUTO-Logik und ist nicht die produktive Firmware.</w:t>
+      </w:r>
+    </w:p>
+    <w:p>
       <w:pPr>
         <w:spacing w:after="200" w:line="269" w:lineRule="auto"/>
         <w:jc w:val="both"/>
@@ -296,6 +332,7 @@
     </w:p>
     <w:sectPr>
       <w:footerReference w:type="default" r:id="rId9"/>
+      <w:headerReference w:type="default" r:id="rId10"/>
       <w:pgSz w:w="12240" w:h="15840"/>
       <w:pgMar w:top="964" w:right="1020" w:bottom="850" w:left="1020" w:header="720" w:footer="720" w:gutter="0"/>
       <w:cols w:space="720"/>
@@ -321,6 +358,16 @@
     </w:r>
   </w:p>
 </w:ftr>
+</file>
+
+<file path=word/header1.xml><?xml version="1.0" encoding="utf-8"?>
+<w:hdr xmlns:m="http://schemas.openxmlformats.org/officeDocument/2006/math" xmlns:mc="http://schemas.openxmlformats.org/markup-compatibility/2006" xmlns:mo="http://schemas.microsoft.com/office/mac/office/2008/main" xmlns:mv="urn:schemas-microsoft-com:mac:vml" xmlns:o="urn:schemas-microsoft-com:office:office" xmlns:r="http://schemas.openxmlformats.org/officeDocument/2006/relationships" xmlns:v="urn:schemas-microsoft-com:vml" xmlns:w10="urn:schemas-microsoft-com:office:word" xmlns:w14="http://schemas.microsoft.com/office/word/2010/wordml" xmlns:w="http://schemas.openxmlformats.org/wordprocessingml/2006/main" xmlns:wne="http://schemas.microsoft.com/office/word/2006/wordml" xmlns:wp14="http://schemas.microsoft.com/office/word/2010/wordprocessingDrawing" xmlns:wp="http://schemas.openxmlformats.org/drawingml/2006/wordprocessingDrawing" xmlns:wpc="http://schemas.microsoft.com/office/word/2010/wordprocessingCanvas" xmlns:wpg="http://schemas.microsoft.com/office/word/2010/wordprocessingGroup" xmlns:wpi="http://schemas.microsoft.com/office/word/2010/wordprocessingInk" xmlns:wps="http://schemas.microsoft.com/office/word/2010/wordprocessingShape" mc:Ignorable="w14 wp14">
+  <w:p>
+    <w:pPr>
+      <w:pStyle w:val="Header"/>
+    </w:pPr>
+  </w:p>
+</w:hdr>
 </file>
 
 <file path=word/numbering.xml><?xml version="1.0" encoding="utf-8"?>

</xml_diff>

<commit_message>
Release SatAlign v3.1.5 with manual fine alignment
Co-authored-by: Copilot App <223556219+Copilot@users.noreply.github.com>
</commit_message>
<xml_diff>
--- a/docs/SatAlign_ESP32_V3_Einfuehrung.docx
+++ b/docs/SatAlign_ESP32_V3_Einfuehrung.docx
@@ -18,13 +18,13 @@
     <w:p>
       <w:pPr/>
       <w:r>
-        <w:t>V3.1.4 baut auf der einheitlichen RF-Prozentbewertung von Anzeige und AUTO-Suche auf. Ein normaler RF-Kandidat wird weiterhin erst ab 80 % akzeptiert; der gemeinsame RF-Wert wird auf maximal 100 % begrenzt. Ein separater reproduzierbarer RF-/Azimut-Test verglich die Filterwerte 0,75, 0,50 und 0,25. RF_FILTER_ALPHA wurde deshalb auf 0,50 gesetzt: deutlich schnellere Reaktion als 0,75 bei weiterhin ruhigerer Anzeige als mit 0,25.</w:t>
+        <w:t>V3.1.5 baut auf der bewaehrten RF-/AUTO-Basis von V3.1.4 auf. Ein normaler RF-Kandidat wird weiterhin erst ab 80 % akzeptiert; der gemeinsame RF-Wert wird auf maximal 100 % begrenzt. RF_FILTER_ALPHA bleibt bei 0,50. Die manuelle Web-UI wurde fuer die letzte Signaloptimierung neu angeordnet: Bei AZ und EL stehen der aktuelle RF-Prozentwert und der gespreizte OPT-Wert direkt zwischen den beiden Feinbuttons. Beim Oeffnen von Manuell wird automatisch eine neue Referenz gesetzt. AZ startet sichtbar bei 0 Schritten und zeigt danach 0 -&gt; +/-n Schritte. Bei EL wird der aktuelle MPU-Winkel als Referenz gespeichert; angezeigt werden Referenzwinkel -&gt; aktueller Winkel sowie die Winkelaenderung. Separate Reset-Buttons sowie Puls-/PWM-Werte entfallen aus der Bedienansicht. Die Feinpulse bleiben technisch zentral auf 50 ms fuer AZ und EL konfiguriert; EL verwendet PWM 90. OPT spreizt RF 80-100 % auf 0-100 % und ist nur eine Anzeigehilfe. Die separate Signalbewertungs-/Diagnosekarte wurde von der manuellen Bedienseite entfernt. Der technische Status ist auf Motorzustand AZ/EL, Hall-Sensoren sowie EL-Winkel mit Softlimits reduziert; doppelte Web-/Live-Zeilen entfallen. Auf der Suchseite wird das Signal fuer den Nutzer primaer als RF-Prozentwert angezeigt. Die Qualitaetsstufen sind konsistent definiert: &lt;80 % schwach, 80-&lt;85 % brauchbar, 85-&lt;95 % gut und &gt;=95 % sehr gut.</w:t>
       </w:r>
     </w:p>
     <w:p>
       <w:pPr/>
       <w:r>
-        <w:t>Softwarestand: V3.1.4</w:t>
+        <w:t>Softwarestand: V3.1.5</w:t>
       </w:r>
     </w:p>
     <w:p>
@@ -60,10 +60,7 @@
     <w:p>
       <w:pPr/>
       <w:r>
-        <w:rPr>
-          <w:b/>
-        </w:rPr>
-        <w:t>Dokumentationsstand: SatAlign ESP32 V3.1.4 (stabiler Release)</w:t>
+        <w:t>Dokumentationsstand: SatAlign ESP32 V3.1.5</w:t>
       </w:r>
     </w:p>
     <w:tbl>
@@ -303,7 +300,7 @@
     <w:p>
       <w:pPr/>
       <w:r>
-        <w:t>Der aktuelle stabile Softwarestand V3.1.4 nutzt eine einheitliche RF-Prozentbewertung, einen auf 0,50 abgestimmten RF-Filter, eine 80-%-Mindestgrenze fuer AUTO-Kandidaten, eine feste IP im GeniusBulli-Netz sowie ArduinoOTA und ElegantOTA. Die automatische Suche bleibt bewusst bei der praktisch bewaehrten Kandidatenlogik; experimentelle Peak-Rueckfahrten gehoeren nicht zum stabilen Release.</w:t>
+        <w:t>Der aktuelle Softwarestand V3.1.5 nutzt eine einheitliche RF-Prozentbewertung, einen auf 0,50 abgestimmten RF-Filter, eine 80-%-Mindestgrenze fuer AUTO-Kandidaten, eine feste IP im GeniusBulli-Netz sowie ArduinoOTA und ElegantOTA. Die automatische Suche bleibt bewusst bei der praktisch bewaehrten Kandidatenlogik; experimentelle Peak-Rueckfahrten gehoeren nicht zum stabilen Release.</w:t>
       </w:r>
     </w:p>
     <w:p>

</xml_diff>